<commit_message>
respostas atv 1 a 3
Co-authored-by: prgrmnd <serejodev@gmail.com>
</commit_message>
<xml_diff>
--- a/Desafio_cerebral_-_RNAs_-_TSC.docx
+++ b/Desafio_cerebral_-_RNAs_-_TSC.docx
@@ -4499,17 +4499,23 @@
         </w:tabs>
         <w:ind w:left="872" w:hanging="358"/>
         <w:rPr>
+          <w:b/>
+          <w:bCs/>
           <w:sz w:val="20"/>
         </w:rPr>
       </w:pPr>
       <w:r>
         <w:rPr>
+          <w:b/>
+          <w:bCs/>
           <w:sz w:val="20"/>
         </w:rPr>
         <w:t>Explique</w:t>
       </w:r>
       <w:r>
         <w:rPr>
+          <w:b/>
+          <w:bCs/>
           <w:spacing w:val="-5"/>
           <w:sz w:val="20"/>
         </w:rPr>
@@ -4517,12 +4523,16 @@
       </w:r>
       <w:r>
         <w:rPr>
+          <w:b/>
+          <w:bCs/>
           <w:sz w:val="20"/>
         </w:rPr>
         <w:t>o</w:t>
       </w:r>
       <w:r>
         <w:rPr>
+          <w:b/>
+          <w:bCs/>
           <w:spacing w:val="-3"/>
           <w:sz w:val="20"/>
         </w:rPr>
@@ -4530,12 +4540,16 @@
       </w:r>
       <w:r>
         <w:rPr>
+          <w:b/>
+          <w:bCs/>
           <w:sz w:val="20"/>
         </w:rPr>
         <w:t>funcionamento</w:t>
       </w:r>
       <w:r>
         <w:rPr>
+          <w:b/>
+          <w:bCs/>
           <w:spacing w:val="-4"/>
           <w:sz w:val="20"/>
         </w:rPr>
@@ -4543,12 +4557,16 @@
       </w:r>
       <w:r>
         <w:rPr>
+          <w:b/>
+          <w:bCs/>
           <w:sz w:val="20"/>
         </w:rPr>
         <w:t>do</w:t>
       </w:r>
       <w:r>
         <w:rPr>
+          <w:b/>
+          <w:bCs/>
           <w:spacing w:val="-4"/>
           <w:sz w:val="20"/>
         </w:rPr>
@@ -4556,12 +4574,16 @@
       </w:r>
       <w:r>
         <w:rPr>
+          <w:b/>
+          <w:bCs/>
           <w:sz w:val="20"/>
         </w:rPr>
         <w:t>neurônio</w:t>
       </w:r>
       <w:r>
         <w:rPr>
+          <w:b/>
+          <w:bCs/>
           <w:spacing w:val="-4"/>
           <w:sz w:val="20"/>
         </w:rPr>
@@ -4569,11 +4591,154 @@
       </w:r>
       <w:r>
         <w:rPr>
+          <w:b/>
+          <w:bCs/>
           <w:spacing w:val="-2"/>
           <w:sz w:val="20"/>
         </w:rPr>
         <w:t>artificial.</w:t>
       </w:r>
+    </w:p>
+    <w:p>
+      <w:pPr>
+        <w:tabs>
+          <w:tab w:val="left" w:pos="872"/>
+        </w:tabs>
+        <w:ind w:left="514"/>
+        <w:rPr>
+          <w:sz w:val="20"/>
+        </w:rPr>
+      </w:pPr>
+    </w:p>
+    <w:p>
+      <w:pPr>
+        <w:tabs>
+          <w:tab w:val="left" w:pos="872"/>
+        </w:tabs>
+        <w:ind w:left="514"/>
+        <w:jc w:val="both"/>
+        <w:rPr>
+          <w:sz w:val="20"/>
+          <w:lang w:val="pt-BR"/>
+        </w:rPr>
+      </w:pPr>
+      <w:r>
+        <w:rPr>
+          <w:sz w:val="20"/>
+          <w:lang w:val="pt-BR"/>
+        </w:rPr>
+        <w:t xml:space="preserve">O neurônio artificial funciona como uma função matemática que imita o comportamento de um neurônio biológico, </w:t>
+      </w:r>
+      <w:r>
+        <w:rPr>
+          <w:sz w:val="20"/>
+        </w:rPr>
+        <w:t>composto por entradas, pesos, um somador e uma função de ativação</w:t>
+      </w:r>
+      <w:r>
+        <w:rPr>
+          <w:sz w:val="20"/>
+          <w:lang w:val="pt-BR"/>
+        </w:rPr>
+        <w:t xml:space="preserve">. </w:t>
+      </w:r>
+      <w:r>
+        <w:rPr>
+          <w:sz w:val="20"/>
+          <w:lang w:val="pt-BR"/>
+        </w:rPr>
+        <w:t>Tudo começa quando o neurônio</w:t>
+      </w:r>
+      <w:r>
+        <w:rPr>
+          <w:sz w:val="20"/>
+          <w:lang w:val="pt-BR"/>
+        </w:rPr>
+        <w:t xml:space="preserve"> recebe um conjunto de dados de entrada</w:t>
+      </w:r>
+      <w:r>
+        <w:rPr>
+          <w:sz w:val="20"/>
+          <w:lang w:val="pt-BR"/>
+        </w:rPr>
+        <w:t>, em seguida c</w:t>
+      </w:r>
+      <w:r>
+        <w:rPr>
+          <w:sz w:val="20"/>
+          <w:lang w:val="pt-BR"/>
+        </w:rPr>
+        <w:t>ada entrada é multiplicada por um peso específico, que funciona como um indicador de importância</w:t>
+      </w:r>
+      <w:r>
+        <w:rPr>
+          <w:sz w:val="20"/>
+          <w:lang w:val="pt-BR"/>
+        </w:rPr>
+        <w:t>, onde</w:t>
+      </w:r>
+      <w:r>
+        <w:rPr>
+          <w:sz w:val="20"/>
+          <w:lang w:val="pt-BR"/>
+        </w:rPr>
+        <w:t xml:space="preserve"> pesos maiores dão mais relevância à entrada, enquanto pesos menores ou negativos reduzem seu impacto.</w:t>
+      </w:r>
+      <w:r>
+        <w:rPr>
+          <w:sz w:val="20"/>
+          <w:lang w:val="pt-BR"/>
+        </w:rPr>
+        <w:t xml:space="preserve"> </w:t>
+      </w:r>
+      <w:r>
+        <w:rPr>
+          <w:sz w:val="20"/>
+          <w:lang w:val="pt-BR"/>
+        </w:rPr>
+        <w:t xml:space="preserve">Em seguida, o neurônio realiza uma junção somadora, calculando a soma de todos os produtos das entradas por seus respectivos pesos e adicionando a esse total um valor constante </w:t>
+      </w:r>
+      <w:proofErr w:type="gramStart"/>
+      <w:r>
+        <w:rPr>
+          <w:sz w:val="20"/>
+          <w:lang w:val="pt-BR"/>
+        </w:rPr>
+        <w:t>chamado bias</w:t>
+      </w:r>
+      <w:proofErr w:type="gramEnd"/>
+      <w:r>
+        <w:rPr>
+          <w:sz w:val="20"/>
+          <w:lang w:val="pt-BR"/>
+        </w:rPr>
+        <w:t xml:space="preserve">, que serve para ajustar a sensibilidade do neurônio. O resultado dessa soma é então passado para uma função de ativação, que decide </w:t>
+      </w:r>
+      <w:r>
+        <w:rPr>
+          <w:sz w:val="20"/>
+          <w:lang w:val="pt-BR"/>
+        </w:rPr>
+        <w:t>qual resposta o neurônio deve “disparar”</w:t>
+      </w:r>
+      <w:r>
+        <w:rPr>
+          <w:sz w:val="20"/>
+          <w:lang w:val="pt-BR"/>
+        </w:rPr>
+        <w:t>. Essa função introduz uma propriedade não-linear ao sistema, permitindo que ele aprenda padrões complexos e gerando a saída final, que pode ser o resultado definitivo do modelo ou a entrada para os próximos neurônios da rede.</w:t>
+      </w:r>
+    </w:p>
+    <w:p>
+      <w:pPr>
+        <w:tabs>
+          <w:tab w:val="left" w:pos="872"/>
+        </w:tabs>
+        <w:ind w:left="514"/>
+        <w:rPr>
+          <w:sz w:val="20"/>
+        </w:rPr>
+      </w:pPr>
     </w:p>
     <w:p>
       <w:pPr>
@@ -4689,6 +4854,114 @@
         </w:rPr>
         <w:t>ativação.</w:t>
       </w:r>
+    </w:p>
+    <w:p>
+      <w:pPr>
+        <w:tabs>
+          <w:tab w:val="left" w:pos="872"/>
+        </w:tabs>
+        <w:spacing w:before="2"/>
+        <w:ind w:left="514"/>
+        <w:rPr>
+          <w:sz w:val="20"/>
+          <w:lang w:val="pt-BR"/>
+        </w:rPr>
+      </w:pPr>
+    </w:p>
+    <w:p>
+      <w:pPr>
+        <w:tabs>
+          <w:tab w:val="left" w:pos="872"/>
+        </w:tabs>
+        <w:spacing w:before="2"/>
+        <w:ind w:left="514"/>
+        <w:jc w:val="both"/>
+        <w:rPr>
+          <w:sz w:val="20"/>
+          <w:lang w:val="pt-BR"/>
+        </w:rPr>
+      </w:pPr>
+      <w:r>
+        <w:rPr>
+          <w:sz w:val="20"/>
+          <w:lang w:val="pt-BR"/>
+        </w:rPr>
+        <w:t>O</w:t>
+      </w:r>
+      <w:r>
+        <w:rPr>
+          <w:sz w:val="20"/>
+          <w:lang w:val="pt-BR"/>
+        </w:rPr>
+        <w:t xml:space="preserve"> objetivo principal de uma função de ativação é quebrar a linearidade dos dados. </w:t>
+      </w:r>
+      <w:r>
+        <w:rPr>
+          <w:sz w:val="20"/>
+          <w:lang w:val="pt-BR"/>
+        </w:rPr>
+        <w:t>Ao</w:t>
+      </w:r>
+      <w:r>
+        <w:rPr>
+          <w:sz w:val="20"/>
+          <w:lang w:val="pt-BR"/>
+        </w:rPr>
+        <w:t xml:space="preserve"> apenas multiplicar as entradas pelos pesos e somar tudo, o neurônio estará fazendo um cálculo puramente linear, uma equação de reta. A função de ativação entra justamente para distorcer essa reta, permitindo que a rede neural consiga desenhar curvas e superfícies complexas para aprender a separar ou classificar esses dados.</w:t>
+      </w:r>
+      <w:r>
+        <w:rPr>
+          <w:sz w:val="20"/>
+          <w:lang w:val="pt-BR"/>
+        </w:rPr>
+        <w:t xml:space="preserve"> </w:t>
+      </w:r>
+      <w:r>
+        <w:rPr>
+          <w:sz w:val="20"/>
+          <w:lang w:val="pt-BR"/>
+        </w:rPr>
+        <w:t>Outro ponto é o controle do fluxo e da escala dessas informações. A soma matemática dentro do neurônio pode gerar números gigantescos ou excessivamente negativos, o que causaria um colapso nos cálculos do computador. A função de ativação atua como um regulador</w:t>
+      </w:r>
+      <w:r>
+        <w:rPr>
+          <w:sz w:val="20"/>
+          <w:lang w:val="pt-BR"/>
+        </w:rPr>
+        <w:t xml:space="preserve"> </w:t>
+      </w:r>
+      <w:r>
+        <w:rPr>
+          <w:sz w:val="20"/>
+          <w:lang w:val="pt-BR"/>
+        </w:rPr>
+        <w:t xml:space="preserve">de dados, pegando qualquer valor infinito e espremendo-o dentro de um intervalo civilizado e padronizado, como </w:t>
+      </w:r>
+      <w:r>
+        <w:rPr>
+          <w:sz w:val="20"/>
+          <w:lang w:val="pt-BR"/>
+        </w:rPr>
+        <w:t>por exemplo o intervalo entre</w:t>
+      </w:r>
+      <w:r>
+        <w:rPr>
+          <w:sz w:val="20"/>
+          <w:lang w:val="pt-BR"/>
+        </w:rPr>
+        <w:t xml:space="preserve"> 0 e 1.</w:t>
+      </w:r>
+    </w:p>
+    <w:p>
+      <w:pPr>
+        <w:tabs>
+          <w:tab w:val="left" w:pos="872"/>
+        </w:tabs>
+        <w:spacing w:before="2"/>
+        <w:rPr>
+          <w:sz w:val="20"/>
+        </w:rPr>
+      </w:pPr>
     </w:p>
     <w:p>
       <w:pPr>
@@ -4723,6 +4996,306 @@
     </w:p>
     <w:p>
       <w:pPr>
+        <w:tabs>
+          <w:tab w:val="left" w:pos="872"/>
+          <w:tab w:val="left" w:pos="874"/>
+        </w:tabs>
+        <w:spacing w:before="2" w:line="242" w:lineRule="auto"/>
+        <w:ind w:left="514" w:right="733"/>
+        <w:rPr>
+          <w:sz w:val="20"/>
+          <w:lang w:val="pt-BR"/>
+        </w:rPr>
+      </w:pPr>
+    </w:p>
+    <w:p>
+      <w:pPr>
+        <w:tabs>
+          <w:tab w:val="left" w:pos="872"/>
+          <w:tab w:val="left" w:pos="874"/>
+        </w:tabs>
+        <w:spacing w:before="2" w:line="242" w:lineRule="auto"/>
+        <w:ind w:left="514" w:right="733"/>
+        <w:jc w:val="both"/>
+        <w:rPr>
+          <w:sz w:val="20"/>
+          <w:lang w:val="pt-BR"/>
+        </w:rPr>
+      </w:pPr>
+      <w:r>
+        <w:rPr>
+          <w:sz w:val="20"/>
+          <w:lang w:val="pt-BR"/>
+        </w:rPr>
+        <w:t>Cada</w:t>
+      </w:r>
+      <w:r>
+        <w:rPr>
+          <w:sz w:val="20"/>
+          <w:lang w:val="pt-BR"/>
+        </w:rPr>
+        <w:t xml:space="preserve"> elemento computacional foi desenhado para simular uma função correspondente na célula viva.</w:t>
+      </w:r>
+      <w:r>
+        <w:rPr>
+          <w:sz w:val="20"/>
+          <w:lang w:val="pt-BR"/>
+        </w:rPr>
+        <w:t xml:space="preserve"> </w:t>
+      </w:r>
+      <w:r>
+        <w:rPr>
+          <w:sz w:val="20"/>
+          <w:lang w:val="pt-BR"/>
+        </w:rPr>
+        <w:t>Começando pela recepção dos dados, o neurônio biológico</w:t>
+      </w:r>
+      <w:r>
+        <w:rPr>
+          <w:sz w:val="20"/>
+          <w:lang w:val="pt-BR"/>
+        </w:rPr>
+        <w:t xml:space="preserve"> possui</w:t>
+      </w:r>
+      <w:r>
+        <w:rPr>
+          <w:sz w:val="20"/>
+          <w:lang w:val="pt-BR"/>
+        </w:rPr>
+        <w:t xml:space="preserve"> os </w:t>
+      </w:r>
+      <w:r>
+        <w:rPr>
+          <w:b/>
+          <w:bCs/>
+          <w:sz w:val="20"/>
+          <w:lang w:val="pt-BR"/>
+        </w:rPr>
+        <w:t>dendritos</w:t>
+      </w:r>
+      <w:r>
+        <w:rPr>
+          <w:sz w:val="20"/>
+          <w:lang w:val="pt-BR"/>
+        </w:rPr>
+        <w:t xml:space="preserve">, que são ramificações que recebem os sinais químicos e elétricos enviados por outras células. No modelo matemático, os dendritos correspondem às </w:t>
+      </w:r>
+      <w:r>
+        <w:rPr>
+          <w:b/>
+          <w:bCs/>
+          <w:sz w:val="20"/>
+          <w:lang w:val="pt-BR"/>
+        </w:rPr>
+        <w:t>entradas</w:t>
+      </w:r>
+      <w:r>
+        <w:rPr>
+          <w:sz w:val="20"/>
+          <w:lang w:val="pt-BR"/>
+        </w:rPr>
+        <w:t xml:space="preserve"> do sistema, que nada mais são do que os dados brutos ou os recursos do problema que estão alimentando o algoritmo.</w:t>
+      </w:r>
+      <w:r>
+        <w:rPr>
+          <w:sz w:val="20"/>
+          <w:lang w:val="pt-BR"/>
+        </w:rPr>
+        <w:t xml:space="preserve"> Como o</w:t>
+      </w:r>
+      <w:r>
+        <w:rPr>
+          <w:sz w:val="20"/>
+          <w:lang w:val="pt-BR"/>
+        </w:rPr>
+        <w:t xml:space="preserve"> cérebro não trata todos os sinais recebidos com a mesma importância; algumas conexões, chamadas de </w:t>
+      </w:r>
+      <w:r>
+        <w:rPr>
+          <w:b/>
+          <w:bCs/>
+          <w:sz w:val="20"/>
+          <w:lang w:val="pt-BR"/>
+        </w:rPr>
+        <w:t>sinapses</w:t>
+      </w:r>
+      <w:r>
+        <w:rPr>
+          <w:sz w:val="20"/>
+          <w:lang w:val="pt-BR"/>
+        </w:rPr>
+        <w:t xml:space="preserve">, são mais fortes que outras, facilitando ou bloqueando a passagem do estímulo. No ambiente artificial, essa intensidade sináptica é representada pelos </w:t>
+      </w:r>
+      <w:r>
+        <w:rPr>
+          <w:b/>
+          <w:bCs/>
+          <w:sz w:val="20"/>
+          <w:lang w:val="pt-BR"/>
+        </w:rPr>
+        <w:t>pesos</w:t>
+      </w:r>
+      <w:r>
+        <w:rPr>
+          <w:sz w:val="20"/>
+          <w:lang w:val="pt-BR"/>
+        </w:rPr>
+        <w:t>. Um peso alto simula uma sinapse forte, tornando aquela entrada muito relevante para o neurônio, enquanto um peso baixo ou negativo simula uma sinapse fraca.</w:t>
+      </w:r>
+      <w:r>
+        <w:rPr>
+          <w:sz w:val="20"/>
+          <w:lang w:val="pt-BR"/>
+        </w:rPr>
+        <w:t xml:space="preserve"> </w:t>
+      </w:r>
+      <w:r>
+        <w:rPr>
+          <w:sz w:val="20"/>
+          <w:lang w:val="pt-BR"/>
+        </w:rPr>
+        <w:t xml:space="preserve">Uma vez que os sinais passam pelas sinapses, eles se concentram no </w:t>
+      </w:r>
+      <w:r>
+        <w:rPr>
+          <w:b/>
+          <w:bCs/>
+          <w:sz w:val="20"/>
+          <w:lang w:val="pt-BR"/>
+        </w:rPr>
+        <w:t>corpo celular</w:t>
+      </w:r>
+      <w:r>
+        <w:rPr>
+          <w:sz w:val="20"/>
+          <w:lang w:val="pt-BR"/>
+        </w:rPr>
+        <w:t xml:space="preserve">, onde a célula biológica integra e mistura todos esses estímulos recebidos de uma vez. No neurônio artificial, o corpo celular é representado pela </w:t>
+      </w:r>
+      <w:r>
+        <w:rPr>
+          <w:b/>
+          <w:bCs/>
+          <w:sz w:val="20"/>
+          <w:lang w:val="pt-BR"/>
+        </w:rPr>
+        <w:t>junção somadora</w:t>
+      </w:r>
+      <w:r>
+        <w:rPr>
+          <w:sz w:val="20"/>
+          <w:lang w:val="pt-BR"/>
+        </w:rPr>
+        <w:t xml:space="preserve">. É nessa etapa que o algoritmo multiplica cada entrada por seu respectivo peso e soma todos os resultados, adicionando também </w:t>
+      </w:r>
+      <w:proofErr w:type="gramStart"/>
+      <w:r>
+        <w:rPr>
+          <w:sz w:val="20"/>
+          <w:lang w:val="pt-BR"/>
+        </w:rPr>
+        <w:t>o bias</w:t>
+      </w:r>
+      <w:proofErr w:type="gramEnd"/>
+      <w:r>
+        <w:rPr>
+          <w:sz w:val="20"/>
+          <w:lang w:val="pt-BR"/>
+        </w:rPr>
+        <w:t xml:space="preserve"> para regular a sensibilidade geral desse corpo celular.</w:t>
+      </w:r>
+      <w:r>
+        <w:rPr>
+          <w:sz w:val="20"/>
+          <w:lang w:val="pt-BR"/>
+        </w:rPr>
+        <w:t xml:space="preserve"> </w:t>
+      </w:r>
+      <w:r>
+        <w:rPr>
+          <w:sz w:val="20"/>
+          <w:lang w:val="pt-BR"/>
+        </w:rPr>
+        <w:t xml:space="preserve">Após somar os estímulos, o corpo celular do neurônio biológico precisa decidir se a energia acumulada é suficiente para gerar um impulso elétrico, o que depende de um limiar químico de ativação. Essa decisão no modelo computacional é tomada pela </w:t>
+      </w:r>
+      <w:r>
+        <w:rPr>
+          <w:b/>
+          <w:bCs/>
+          <w:sz w:val="20"/>
+          <w:lang w:val="pt-BR"/>
+        </w:rPr>
+        <w:t>função de ativação</w:t>
+      </w:r>
+      <w:r>
+        <w:rPr>
+          <w:sz w:val="20"/>
+          <w:lang w:val="pt-BR"/>
+        </w:rPr>
+        <w:t>, que analisa o valor da soma e define se o neurônio artificial deve disparar uma resposta e qual será a intensidade dela.</w:t>
+      </w:r>
+      <w:r>
+        <w:rPr>
+          <w:sz w:val="20"/>
+          <w:lang w:val="pt-BR"/>
+        </w:rPr>
+        <w:t xml:space="preserve"> </w:t>
+      </w:r>
+      <w:r>
+        <w:rPr>
+          <w:sz w:val="20"/>
+          <w:lang w:val="pt-BR"/>
+        </w:rPr>
+        <w:t xml:space="preserve">Por fim, se o neurônio biológico decide disparar, o impulso elétrico viaja através de uma extensão longa chamada </w:t>
+      </w:r>
+      <w:r>
+        <w:rPr>
+          <w:b/>
+          <w:bCs/>
+          <w:sz w:val="20"/>
+          <w:lang w:val="pt-BR"/>
+        </w:rPr>
+        <w:t>axônio</w:t>
+      </w:r>
+      <w:r>
+        <w:rPr>
+          <w:sz w:val="20"/>
+          <w:lang w:val="pt-BR"/>
+        </w:rPr>
+        <w:t xml:space="preserve"> para alcançar a próxima célula. No neurônio artificial, o axônio é a própria </w:t>
+      </w:r>
+      <w:r>
+        <w:rPr>
+          <w:b/>
+          <w:bCs/>
+          <w:sz w:val="20"/>
+          <w:lang w:val="pt-BR"/>
+        </w:rPr>
+        <w:t>saída</w:t>
+      </w:r>
+      <w:r>
+        <w:rPr>
+          <w:sz w:val="20"/>
+          <w:lang w:val="pt-BR"/>
+        </w:rPr>
+        <w:t xml:space="preserve"> do sistema, que transporta o valor final processado para fora daquele neurônio, servindo como a resposta definitiva ou como informação para a próxima camada da rede.</w:t>
+      </w:r>
+    </w:p>
+    <w:p>
+      <w:pPr>
+        <w:tabs>
+          <w:tab w:val="left" w:pos="872"/>
+          <w:tab w:val="left" w:pos="874"/>
+        </w:tabs>
+        <w:spacing w:before="2" w:line="242" w:lineRule="auto"/>
+        <w:ind w:right="733"/>
+        <w:rPr>
+          <w:sz w:val="20"/>
+        </w:rPr>
+      </w:pPr>
+    </w:p>
+    <w:p>
+      <w:pPr>
         <w:pStyle w:val="PargrafodaLista"/>
         <w:numPr>
           <w:ilvl w:val="0"/>
@@ -4847,6 +5420,38 @@
           <w:sz w:val="20"/>
         </w:rPr>
         <w:t>ativação.</w:t>
+      </w:r>
+    </w:p>
+    <w:p>
+      <w:pPr>
+        <w:tabs>
+          <w:tab w:val="left" w:pos="872"/>
+        </w:tabs>
+        <w:spacing w:line="225" w:lineRule="exact"/>
+        <w:ind w:left="514"/>
+        <w:rPr>
+          <w:sz w:val="20"/>
+        </w:rPr>
+      </w:pPr>
+      <w:r>
+        <w:rPr>
+          <w:sz w:val="20"/>
+        </w:rPr>
+        <w:t xml:space="preserve">O </w:t>
+      </w:r>
+      <w:r>
+        <w:rPr>
+          <w:b/>
+          <w:bCs/>
+          <w:sz w:val="20"/>
+        </w:rPr>
+        <w:t>limiar de ativação</w:t>
+      </w:r>
+      <w:r>
+        <w:rPr>
+          <w:sz w:val="20"/>
+        </w:rPr>
+        <w:t xml:space="preserve"> é o valor crítico ou a barreira que determina se um neurônio deve ou não disparar um sinal.</w:t>
       </w:r>
     </w:p>
     <w:p>
@@ -4894,6 +5499,7 @@
         <w:rPr>
           <w:sz w:val="20"/>
         </w:rPr>
+        <w:lastRenderedPageBreak/>
         <w:t>Discorra</w:t>
       </w:r>
       <w:r>
@@ -7000,8 +7606,9 @@
         <w:sectPr>
           <w:type w:val="continuous"/>
           <w:pgSz w:w="11900" w:h="16840"/>
-          <w:pgMar w:top="840" w:right="850" w:bottom="280" w:left="1559" w:header="720" w:footer="720" w:gutter="0"/>
+          <w:pgMar w:top="720" w:right="720" w:bottom="720" w:left="720" w:header="720" w:footer="720" w:gutter="0"/>
           <w:cols w:space="720"/>
+          <w:docGrid w:linePitch="299"/>
         </w:sectPr>
       </w:pPr>
     </w:p>
@@ -12937,7 +13544,6 @@
   <w:style w:type="character" w:default="1" w:styleId="Fontepargpadro">
     <w:name w:val="Default Paragraph Font"/>
     <w:uiPriority w:val="1"/>
-    <w:semiHidden/>
     <w:unhideWhenUsed/>
   </w:style>
   <w:style w:type="table" w:default="1" w:styleId="Tabelanormal">

</xml_diff>